<commit_message>
docs: remove temporary token wording from ERS and ECUD
The server keeps tokens in memory with no expiry, so drop the 30-minute validity, session-expired flow and AUTH-004 from the documents.
</commit_message>
<xml_diff>
--- a/01. UML/01. ERS/ERS_SOAP_JAVA_SINBDD_GR4.docx
+++ b/01. UML/01. ERS/ERS_SOAP_JAVA_SINBDD_GR4.docx
@@ -15518,7 +15518,7 @@
               <w:rPr>
                 <w:rFonts w:ascii="Times New Roman" w:hAnsi="Times New Roman" w:cs="Times New Roman"/>
               </w:rPr>
-              <w:t>Validar las credenciales ingresadas por el usuario, definidas en el código del servidor, y emitir un token de seguridad temporal que le permita usar los servicios del sistema.</w:t>
+              <w:t>Validar las credenciales ingresadas por el usuario, definidas en el código del servidor, y emitir un token de seguridad que le permita usar los servicios del sistema.</w:t>
             </w:r>
           </w:p>
         </w:tc>
@@ -16885,7 +16885,7 @@
               <w:rPr>
                 <w:rFonts w:ascii="Times New Roman" w:hAnsi="Times New Roman" w:cs="Times New Roman"/>
               </w:rPr>
-              <w:t>El sistema debe recibir credenciales de acceso, validarlas y generar un token de seguridad temporal para autorizar el uso de los servicios.</w:t>
+              <w:t>El sistema debe recibir credenciales de acceso, validarlas y generar un token de seguridad para autorizar el uso de los servicios.</w:t>
             </w:r>
           </w:p>
         </w:tc>
@@ -17386,7 +17386,7 @@
                 <w:sz w:val="21"/>
                 <w:szCs w:val="21"/>
               </w:rPr>
-              <w:t>El sistema debe validar el usuario y la contraseña ingresados y, si son correctos, entregar un token de acceso temporal. Si son incorrectos, debe rechazar el acceso e informar al usuario.</w:t>
+              <w:t>El sistema debe validar el usuario y la contraseña ingresados y, si son correctos, entregar un token de acceso. Si son incorrectos, debe rechazar el acceso e informar al usuario.</w:t>
             </w:r>
           </w:p>
         </w:tc>
@@ -20029,7 +20029,7 @@
                 <w:i w:val="0"/>
                 <w:iCs w:val="0"/>
               </w:rPr>
-              <w:t>El sistema solo debe procesar solicitudes de conversión que incluyan un token válido, obtenido previamente al iniciar sesión. Las solicitudes sin token, o con un token inválido o vencido, deben rechazarse de inmediato. Los clientes solo habilitarán las opciones de conversión cuando el usuario tenga una sesión activa</w:t>
+              <w:t>El sistema solo debe procesar solicitudes de conversión que incluyan un token válido, obtenido previamente al iniciar sesión. Las solicitudes sin token, o con un token inválido, deben rechazarse de inmediato. Los clientes solo habilitarán las opciones de conversión cuando el usuario tenga una sesión activa</w:t>
             </w:r>
             <w:r>
               <w:rPr>
@@ -23273,7 +23273,7 @@
         <w:rPr>
           <w:rFonts w:ascii="Times New Roman" w:hAnsi="Times New Roman" w:cs="Times New Roman"/>
         </w:rPr>
-        <w:t>Mensajes de confirmación cuando el inicio de sesión o la conversión se realicen correctamente, y mensajes de error cuando haya datos inválidos, credenciales incorrectas, un token vencido o problemas de conexión.</w:t>
+        <w:t>Mensajes de confirmación cuando el inicio de sesión o la conversión se realicen correctamente, y mensajes de error cuando haya datos inválidos, credenciales incorrectas, un token inválido o problemas de conexión.</w:t>
       </w:r>
     </w:p>
     <w:p>
@@ -23732,7 +23732,7 @@
         <w:rPr>
           <w:rFonts w:ascii="Times New Roman" w:hAnsi="Times New Roman" w:cs="Times New Roman"/>
         </w:rPr>
-        <w:t>Definir el tiempo de vigencia del token y, cuando la sesión venza, mostrar un mensaje claro que pida volver a iniciar sesión.</w:t>
+        <w:t>Mostrar un mensaje claro que pida volver a iniciar sesión cuando el token de seguridad no sea válido.</w:t>
       </w:r>
     </w:p>
     <w:p>

</xml_diff>